<commit_message>
Update dataset and project documentation
</commit_message>
<xml_diff>
--- a/PushpamSharma_ProjectReport.docx
+++ b/PushpamSharma_ProjectReport.docx
@@ -4,13 +4,10 @@
   <w:body>
     <w:p>
       <w:pPr>
+        <w:pStyle w:val="Title"/>
         <w:jc w:val="center"/>
       </w:pPr>
       <w:r>
-        <w:rPr>
-          <w:b/>
-          <w:sz w:val="40"/>
-        </w:rPr>
         <w:t>PIZZA SALES ANALYTICS &amp; BUSINESS INTELLIGENCE</w:t>
       </w:r>
     </w:p>
@@ -19,57 +16,18 @@
         <w:jc w:val="center"/>
       </w:pPr>
       <w:r>
-        <w:rPr>
-          <w:b/>
-          <w:sz w:val="26"/>
-        </w:rPr>
         <w:t>AICTE | IBM SkillsBuild Data Analytics with AI Internship 2026</w:t>
       </w:r>
-    </w:p>
-    <w:p>
-      <w:pPr>
-        <w:jc w:val="center"/>
-      </w:pPr>
       <w:r>
-        <w:rPr>
-          <w:b/>
-        </w:rPr>
-        <w:t>BharatCares</w:t>
+        <w:br/>
+        <w:t>BharatCares in association with AICTE</w:t>
       </w:r>
       <w:r>
-        <w:t xml:space="preserve"> in association with </w:t>
-      </w:r>
-      <w:r>
-        <w:rPr>
-          <w:b/>
-        </w:rPr>
-        <w:t>AICTE</w:t>
-      </w:r>
-    </w:p>
-    <w:p>
-      <w:pPr>
-        <w:jc w:val="center"/>
-      </w:pPr>
-      <w:r>
-        <w:rPr>
-          <w:b/>
-        </w:rPr>
-        <w:br/>
-        <w:t>Submitted by</w:t>
-      </w:r>
-      <w:r>
-        <w:rPr>
-          <w:b/>
-        </w:rPr>
         <w:br/>
       </w:r>
       <w:r>
-        <w:t>Pushpam Sharma</w:t>
-      </w:r>
-    </w:p>
-    <w:p>
-      <w:r>
-        <w:br w:type="page"/>
+        <w:br/>
+        <w:t>Submitted by: Pushpam Sharma</w:t>
       </w:r>
     </w:p>
     <w:p>
@@ -77,13 +35,12 @@
         <w:pStyle w:val="Heading1"/>
       </w:pPr>
       <w:r>
-        <w:lastRenderedPageBreak/>
         <w:t>1. Abstract</w:t>
       </w:r>
     </w:p>
     <w:p>
       <w:r>
-        <w:t>This project presents a data analytics and business intelligence solution for pizza sales data. The solution uses interactive Power BI dashboards to monitor key performance indicators, analyze revenue and order trends, compare product/category/size performance, examine time and operational patterns, and explore business drivers through advanced Power BI analytics. The project is designed to convert transactional data into information, insights and potential business actions.</w:t>
+        <w:t>This project presents a data analytics and business intelligence solution for pizza sales transactions. It combines Python-based exploratory analysis with an interactive Power BI dashboard to monitor key performance indicators, examine product and category performance, study time patterns, and explore business drivers.</w:t>
       </w:r>
     </w:p>
     <w:p>
@@ -91,12 +48,12 @@
         <w:pStyle w:val="Heading1"/>
       </w:pPr>
       <w:r>
-        <w:t>2. Introduction</w:t>
+        <w:t>2. Problem Statement</w:t>
       </w:r>
     </w:p>
     <w:p>
       <w:r>
-        <w:t>Sales transactions contain useful information about revenue, orders, product demand and operating patterns. A business intelligence dashboard can organize these measures into a form that helps users monitor performance and investigate areas that require attention. This project develops such an analytical view for pizza sales.</w:t>
+        <w:t>Pizza sales transactions contain revenue, order, product, size, category, and time information. When these measures are viewed separately, it is difficult to identify patterns that can support business decisions. This project organizes the information into a structured analytics workflow.</w:t>
       </w:r>
     </w:p>
     <w:p>
@@ -104,12 +61,28 @@
         <w:pStyle w:val="Heading1"/>
       </w:pPr>
       <w:r>
-        <w:t>3. Problem Statement</w:t>
+        <w:t>3. Objectives</w:t>
       </w:r>
     </w:p>
     <w:p>
       <w:r>
-        <w:t>Pizza sales data can become difficult to interpret when revenue, product, category, size and time information are viewed separately. The project addresses this by bringing the major analytical views together in an interactive dashboard and supporting the dashboard with a reproducible Python analysis workflow.</w:t>
+        <w:t>• Analyze revenue, orders, and quantity sold.</w:t>
+      </w:r>
+      <w:r>
+        <w:br/>
+        <w:t>• Examine product, category, and size performance.</w:t>
+      </w:r>
+      <w:r>
+        <w:br/>
+        <w:t>• Analyze day, hour, day-part, and monthly patterns.</w:t>
+      </w:r>
+      <w:r>
+        <w:br/>
+        <w:t>• Use Power BI advanced analytics features to investigate drivers.</w:t>
+      </w:r>
+      <w:r>
+        <w:br/>
+        <w:t>• Convert validated findings into evidence-based business actions.</w:t>
       </w:r>
     </w:p>
     <w:p>
@@ -117,71 +90,34 @@
         <w:pStyle w:val="Heading1"/>
       </w:pPr>
       <w:r>
-        <w:t>4. Objectives</w:t>
+        <w:t>4. Dataset</w:t>
       </w:r>
     </w:p>
     <w:p>
-      <w:pPr>
-        <w:pStyle w:val="ListBullet"/>
-      </w:pPr>
       <w:r>
-        <w:t>Analyze overall revenue, orders and quantity sold.</w:t>
+        <w:t>The project uses the Maven Analytics Pizza Place Sales dataset. Maven describes it as a year of sales from a fictitious pizza place and lists 48,620 records and 12 fields. The original challenge describes four related tables: Orders, Order Details, Pizzas, and Pizza Types. The project Excel file is a flattened 12-column version used for analysis.</w:t>
       </w:r>
-    </w:p>
-    <w:p>
-      <w:pPr>
-        <w:pStyle w:val="ListBullet"/>
-      </w:pPr>
       <w:r>
-        <w:t>Monitor year-over-year revenue performance.</w:t>
+        <w:br/>
       </w:r>
-    </w:p>
-    <w:p>
-      <w:pPr>
-        <w:pStyle w:val="ListBullet"/>
-      </w:pPr>
       <w:r>
-        <w:t>Identify high- and low-performing pizza products.</w:t>
+        <w:br/>
+        <w:t>Official dataset source: https://mavenanalytics.io/data-playground/pizza-place-sales</w:t>
       </w:r>
-    </w:p>
-    <w:p>
-      <w:pPr>
-        <w:pStyle w:val="ListBullet"/>
-      </w:pPr>
       <w:r>
-        <w:t>Analyze performance by pizza category and size.</w:t>
+        <w:br/>
+        <w:t>Related challenge: https://mavenanalytics.io/challenges/maven-pizza-challenge</w:t>
       </w:r>
-    </w:p>
-    <w:p>
-      <w:pPr>
-        <w:pStyle w:val="ListBullet"/>
-      </w:pPr>
       <w:r>
-        <w:t>Analyze revenue by day, hour, day-part and month.</w:t>
+        <w:br/>
       </w:r>
-    </w:p>
-    <w:p>
-      <w:pPr>
-        <w:pStyle w:val="ListBullet"/>
-      </w:pPr>
       <w:r>
-        <w:t>Provide interactive filtering and detailed product analysis.</w:t>
+        <w:br/>
+        <w:t xml:space="preserve">The supplied Excel file contains 48,620 data rows and 12 columns: pizza_id, order_id, pizza_name_id, </w:t>
       </w:r>
-    </w:p>
-    <w:p>
-      <w:pPr>
-        <w:pStyle w:val="ListBullet"/>
-      </w:pPr>
       <w:r>
-        <w:t>Use advanced Power BI analytics features to explore business drivers.</w:t>
-      </w:r>
-    </w:p>
-    <w:p>
-      <w:pPr>
-        <w:pStyle w:val="ListBullet"/>
-      </w:pPr>
-      <w:r>
-        <w:t>Translate supported findings into business-oriented recommendations.</w:t>
+        <w:lastRenderedPageBreak/>
+        <w:t>quantity, order_date, order_time, unit_price, total_price, pizza_size, pizza_category, pizza_ingredients, and pizza_name.</w:t>
       </w:r>
     </w:p>
     <w:p>
@@ -193,84 +129,8 @@
       </w:r>
     </w:p>
     <w:p>
-      <w:pPr>
-        <w:pStyle w:val="ListBullet"/>
-      </w:pPr>
       <w:r>
-        <w:t>Microsoft Power BI</w:t>
-      </w:r>
-    </w:p>
-    <w:p>
-      <w:pPr>
-        <w:pStyle w:val="ListBullet"/>
-      </w:pPr>
-      <w:r>
-        <w:t>Power Query</w:t>
-      </w:r>
-    </w:p>
-    <w:p>
-      <w:pPr>
-        <w:pStyle w:val="ListBullet"/>
-      </w:pPr>
-      <w:r>
-        <w:t>DAX</w:t>
-      </w:r>
-    </w:p>
-    <w:p>
-      <w:pPr>
-        <w:pStyle w:val="ListBullet"/>
-      </w:pPr>
-      <w:r>
-        <w:t>Python</w:t>
-      </w:r>
-    </w:p>
-    <w:p>
-      <w:pPr>
-        <w:pStyle w:val="ListBullet"/>
-      </w:pPr>
-      <w:r>
-        <w:t>Jupyter Notebook</w:t>
-      </w:r>
-    </w:p>
-    <w:p>
-      <w:pPr>
-        <w:pStyle w:val="ListBullet"/>
-      </w:pPr>
-      <w:r>
-        <w:t>Pandas</w:t>
-      </w:r>
-    </w:p>
-    <w:p>
-      <w:pPr>
-        <w:pStyle w:val="ListBullet"/>
-      </w:pPr>
-      <w:r>
-        <w:t>NumPy</w:t>
-      </w:r>
-    </w:p>
-    <w:p>
-      <w:pPr>
-        <w:pStyle w:val="ListBullet"/>
-      </w:pPr>
-      <w:r>
-        <w:t>Matplotlib</w:t>
-      </w:r>
-    </w:p>
-    <w:p>
-      <w:pPr>
-        <w:pStyle w:val="ListBullet"/>
-      </w:pPr>
-      <w:r>
-        <w:t>Seaborn</w:t>
-      </w:r>
-    </w:p>
-    <w:p>
-      <w:pPr>
-        <w:pStyle w:val="ListBullet"/>
-      </w:pPr>
-      <w:r>
-        <w:lastRenderedPageBreak/>
-        <w:t>GitHub</w:t>
+        <w:t>Microsoft Power BI, Power Query, DAX, Python, Jupyter Notebook, Pandas, NumPy, Matplotlib, Seaborn, OpenPyXL, and GitHub.</w:t>
       </w:r>
     </w:p>
     <w:p>
@@ -278,12 +138,12 @@
         <w:pStyle w:val="Heading1"/>
       </w:pPr>
       <w:r>
-        <w:t>6. Project Methodology</w:t>
+        <w:t>6. Methodology</w:t>
       </w:r>
     </w:p>
     <w:p>
       <w:r>
-        <w:t>The project follows the analytical flow: Raw Sales Data → Data Preparation → Exploratory Analysis → KPI Analysis → Power BI Visualization → Advanced Analytics → Business Insights → Recommendations.</w:t>
+        <w:t>Raw Sales Data → Data Preparation → Exploratory Analysis → KPI Analysis → Power BI Visualization → Advanced Analytics → Business Insights → Potential Actions.</w:t>
       </w:r>
     </w:p>
     <w:p>
@@ -291,196 +151,14 @@
         <w:pStyle w:val="Heading1"/>
       </w:pPr>
       <w:r>
-        <w:t>7. Dashboard Structure</w:t>
+        <w:t>7. Power BI Dashboard</w:t>
       </w:r>
     </w:p>
-    <w:tbl>
-      <w:tblPr>
-        <w:tblStyle w:val="TableGrid"/>
-        <w:tblW w:w="0" w:type="auto"/>
-        <w:jc w:val="center"/>
-        <w:tblLook w:val="04A0" w:firstRow="1" w:lastRow="0" w:firstColumn="1" w:lastColumn="0" w:noHBand="0" w:noVBand="1"/>
-      </w:tblPr>
-      <w:tblGrid>
-        <w:gridCol w:w="4320"/>
-        <w:gridCol w:w="4320"/>
-      </w:tblGrid>
-      <w:tr>
-        <w:trPr>
-          <w:jc w:val="center"/>
-        </w:trPr>
-        <w:tc>
-          <w:tcPr>
-            <w:tcW w:w="4320" w:type="dxa"/>
-          </w:tcPr>
-          <w:p>
-            <w:r>
-              <w:t>Dashboard Page</w:t>
-            </w:r>
-          </w:p>
-        </w:tc>
-        <w:tc>
-          <w:tcPr>
-            <w:tcW w:w="4320" w:type="dxa"/>
-          </w:tcPr>
-          <w:p>
-            <w:r>
-              <w:t>Purpose</w:t>
-            </w:r>
-          </w:p>
-        </w:tc>
-      </w:tr>
-      <w:tr>
-        <w:trPr>
-          <w:jc w:val="center"/>
-        </w:trPr>
-        <w:tc>
-          <w:tcPr>
-            <w:tcW w:w="4320" w:type="dxa"/>
-          </w:tcPr>
-          <w:p>
-            <w:r>
-              <w:t>Executive Dashboard</w:t>
-            </w:r>
-          </w:p>
-        </w:tc>
-        <w:tc>
-          <w:tcPr>
-            <w:tcW w:w="4320" w:type="dxa"/>
-          </w:tcPr>
-          <w:p>
-            <w:r>
-              <w:t>KPI monitoring, revenue comparison, category and size analysis.</w:t>
-            </w:r>
-          </w:p>
-        </w:tc>
-      </w:tr>
-      <w:tr>
-        <w:trPr>
-          <w:jc w:val="center"/>
-        </w:trPr>
-        <w:tc>
-          <w:tcPr>
-            <w:tcW w:w="4320" w:type="dxa"/>
-          </w:tcPr>
-          <w:p>
-            <w:r>
-              <w:t>Product Performance</w:t>
-            </w:r>
-          </w:p>
-        </w:tc>
-        <w:tc>
-          <w:tcPr>
-            <w:tcW w:w="4320" w:type="dxa"/>
-          </w:tcPr>
-          <w:p>
-            <w:r>
-              <w:t>Product ranking and analysis of products that may be promoted or reviewed.</w:t>
-            </w:r>
-          </w:p>
-        </w:tc>
-      </w:tr>
-      <w:tr>
-        <w:trPr>
-          <w:jc w:val="center"/>
-        </w:trPr>
-        <w:tc>
-          <w:tcPr>
-            <w:tcW w:w="4320" w:type="dxa"/>
-          </w:tcPr>
-          <w:p>
-            <w:r>
-              <w:t>Time &amp; Operational Analysis</w:t>
-            </w:r>
-          </w:p>
-        </w:tc>
-        <w:tc>
-          <w:tcPr>
-            <w:tcW w:w="4320" w:type="dxa"/>
-          </w:tcPr>
-          <w:p>
-            <w:r>
-              <w:t>Revenue analysis by day, hour, day-part and month.</w:t>
-            </w:r>
-          </w:p>
-        </w:tc>
-      </w:tr>
-      <w:tr>
-        <w:trPr>
-          <w:jc w:val="center"/>
-        </w:trPr>
-        <w:tc>
-          <w:tcPr>
-            <w:tcW w:w="4320" w:type="dxa"/>
-          </w:tcPr>
-          <w:p>
-            <w:r>
-              <w:t>Advanced Analytics</w:t>
-            </w:r>
-          </w:p>
-        </w:tc>
-        <w:tc>
-          <w:tcPr>
-            <w:tcW w:w="4320" w:type="dxa"/>
-          </w:tcPr>
-          <w:p>
-            <w:r>
-              <w:t>Decomposition Tree, Key Influencers, Q&amp;A and ranking analysis.</w:t>
-            </w:r>
-          </w:p>
-        </w:tc>
-      </w:tr>
-      <w:tr>
-        <w:trPr>
-          <w:jc w:val="center"/>
-        </w:trPr>
-        <w:tc>
-          <w:tcPr>
-            <w:tcW w:w="4320" w:type="dxa"/>
-          </w:tcPr>
-          <w:p>
-            <w:r>
-              <w:t>Pizza Details</w:t>
-            </w:r>
-          </w:p>
-        </w:tc>
-        <w:tc>
-          <w:tcPr>
-            <w:tcW w:w="4320" w:type="dxa"/>
-          </w:tcPr>
-          <w:p>
-            <w:r>
-              <w:t>Detailed product-level analysis.</w:t>
-            </w:r>
-          </w:p>
-        </w:tc>
-      </w:tr>
-      <w:tr>
-        <w:trPr>
-          <w:jc w:val="center"/>
-        </w:trPr>
-        <w:tc>
-          <w:tcPr>
-            <w:tcW w:w="4320" w:type="dxa"/>
-          </w:tcPr>
-          <w:p>
-            <w:r>
-              <w:t>Pizza Tooltip</w:t>
-            </w:r>
-          </w:p>
-        </w:tc>
-        <w:tc>
-          <w:tcPr>
-            <w:tcW w:w="4320" w:type="dxa"/>
-          </w:tcPr>
-          <w:p>
-            <w:r>
-              <w:t>Contextual product information including revenue, orders, quantity, contribution and rank.</w:t>
-            </w:r>
-          </w:p>
-        </w:tc>
-      </w:tr>
-    </w:tbl>
+    <w:p>
+      <w:r>
+        <w:t>The Power BI report is organized into Executive Dashboard, Product Performance, Time &amp; Operational Analysis, Advanced Analytics, Pizza Details, and Pizza Tooltip pages. The dashboard supports KPI monitoring, filtering, product analysis, time analysis, decomposition-tree exploration, Key Influencers, Q&amp;A, and ranking analysis.</w:t>
+      </w:r>
+    </w:p>
     <w:p>
       <w:pPr>
         <w:pStyle w:val="Heading1"/>
@@ -490,67 +168,8 @@
       </w:r>
     </w:p>
     <w:p>
-      <w:pPr>
-        <w:pStyle w:val="ListBullet"/>
-      </w:pPr>
       <w:r>
-        <w:t>Total Revenue</w:t>
-      </w:r>
-    </w:p>
-    <w:p>
-      <w:pPr>
-        <w:pStyle w:val="ListBullet"/>
-      </w:pPr>
-      <w:r>
-        <w:t>Total Orders</w:t>
-      </w:r>
-    </w:p>
-    <w:p>
-      <w:pPr>
-        <w:pStyle w:val="ListBullet"/>
-      </w:pPr>
-      <w:r>
-        <w:t>Total Pizzas Sold</w:t>
-      </w:r>
-    </w:p>
-    <w:p>
-      <w:pPr>
-        <w:pStyle w:val="ListBullet"/>
-      </w:pPr>
-      <w:r>
-        <w:t>Average Order Value</w:t>
-      </w:r>
-    </w:p>
-    <w:p>
-      <w:pPr>
-        <w:pStyle w:val="ListBullet"/>
-      </w:pPr>
-      <w:r>
-        <w:t>Revenue YoY %</w:t>
-      </w:r>
-    </w:p>
-    <w:p>
-      <w:pPr>
-        <w:pStyle w:val="ListBullet"/>
-      </w:pPr>
-      <w:r>
-        <w:t>Average Pizzas per Order</w:t>
-      </w:r>
-    </w:p>
-    <w:p>
-      <w:pPr>
-        <w:pStyle w:val="ListBullet"/>
-      </w:pPr>
-      <w:r>
-        <w:t>Revenue % of Total</w:t>
-      </w:r>
-    </w:p>
-    <w:p>
-      <w:pPr>
-        <w:pStyle w:val="ListBullet"/>
-      </w:pPr>
-      <w:r>
-        <w:t>Pizza/Product Ranking</w:t>
+        <w:t>The project tracks Total Revenue, Total Orders, Total Pizzas Sold, Average Order Value, Average Pizzas per Order, Revenue % of Total, Revenue YoY %, and product/revenue ranking where applicable.</w:t>
       </w:r>
     </w:p>
     <w:p>
@@ -558,60 +177,12 @@
         <w:pStyle w:val="Heading1"/>
       </w:pPr>
       <w:r>
-        <w:t>9. Analytics Performed</w:t>
-      </w:r>
-    </w:p>
-    <w:p>
-      <w:pPr>
-        <w:pStyle w:val="Heading2"/>
-      </w:pPr>
-      <w:r>
-        <w:t>9.1 Executive Analysis</w:t>
+        <w:t>9. Python Analysis</w:t>
       </w:r>
     </w:p>
     <w:p>
       <w:r>
-        <w:t>The Executive Dashboard provides a consolidated view of major KPIs and allows users to filter the analysis by pizza category, pizza size and day part.</w:t>
-      </w:r>
-    </w:p>
-    <w:p>
-      <w:pPr>
-        <w:pStyle w:val="Heading2"/>
-      </w:pPr>
-      <w:r>
-        <w:t>9.2 Product Analysis</w:t>
-      </w:r>
-    </w:p>
-    <w:p>
-      <w:r>
-        <w:t>The Product Performance page provides product ranking and supports identification of products that could be considered for promotion or further review.</w:t>
-      </w:r>
-    </w:p>
-    <w:p>
-      <w:pPr>
-        <w:pStyle w:val="Heading2"/>
-      </w:pPr>
-      <w:r>
-        <w:lastRenderedPageBreak/>
-        <w:t>9.3 Time and Operational Analysis</w:t>
-      </w:r>
-    </w:p>
-    <w:p>
-      <w:r>
-        <w:t>Revenue is examined across days, hours, day parts and months to identify temporal patterns that can support operational planning.</w:t>
-      </w:r>
-    </w:p>
-    <w:p>
-      <w:pPr>
-        <w:pStyle w:val="Heading2"/>
-      </w:pPr>
-      <w:r>
-        <w:t>9.4 Advanced Analytics</w:t>
-      </w:r>
-    </w:p>
-    <w:p>
-      <w:r>
-        <w:t>The Advanced Analytics page uses Power BI Decomposition Tree, Key Influencers, Q&amp;A and ranking analysis to explore relationships and potential drivers in the sales data.</w:t>
+        <w:t>The Jupyter notebook loads the Excel dataset, checks its shape and fields, inspects data types, missing values and duplicates, prepares date/time features, calculates KPIs, and performs category, product, day, and hour analysis.</w:t>
       </w:r>
     </w:p>
     <w:p>
@@ -624,7 +195,7 @@
     </w:p>
     <w:p>
       <w:r>
-        <w:t>The final analysis should express findings using the structure: Finding → Evidence → Business Implication → Recommended Action. Specific numerical claims should be inserted only after validating the dataset and dashboard outputs.</w:t>
+        <w:t>Findings should be documented as: Finding → Evidence → Business Implication → Recommended Action. Numerical conclusions should be taken from the validated dataset and dashboard outputs rather than assumed.</w:t>
       </w:r>
     </w:p>
     <w:p>
@@ -632,47 +203,12 @@
         <w:pStyle w:val="Heading1"/>
       </w:pPr>
       <w:r>
-        <w:t>11. Business Recommendations</w:t>
+        <w:t>11. Dataset Compliance Note</w:t>
       </w:r>
     </w:p>
     <w:p>
-      <w:pPr>
-        <w:pStyle w:val="ListBullet"/>
-      </w:pPr>
       <w:r>
-        <w:t>Monitor high-level revenue and order KPIs regularly.</w:t>
-      </w:r>
-    </w:p>
-    <w:p>
-      <w:pPr>
-        <w:pStyle w:val="ListBullet"/>
-      </w:pPr>
-      <w:r>
-        <w:t>Use product performance analysis to identify products suitable for promotion or review.</w:t>
-      </w:r>
-    </w:p>
-    <w:p>
-      <w:pPr>
-        <w:pStyle w:val="ListBullet"/>
-      </w:pPr>
-      <w:r>
-        <w:t>Use peak day/hour/day-part patterns for operational and inventory planning.</w:t>
-      </w:r>
-    </w:p>
-    <w:p>
-      <w:pPr>
-        <w:pStyle w:val="ListBullet"/>
-      </w:pPr>
-      <w:r>
-        <w:t>Monitor year-over-year changes to identify periods requiring further investigation.</w:t>
-      </w:r>
-    </w:p>
-    <w:p>
-      <w:pPr>
-        <w:pStyle w:val="ListBullet"/>
-      </w:pPr>
-      <w:r>
-        <w:t>Use advanced analytics to investigate possible drivers before taking business action.</w:t>
+        <w:t>The internship submission instructions state that the exact dataset used in internship/masterclass sessions must not be reused. The public Maven source is documented above. The public source alone does not establish whether this dataset was used in a BharatCares/IBM session, so that point must be confirmed against the internship session materials before final submission.</w:t>
       </w:r>
     </w:p>
     <w:p>
@@ -680,30 +216,13 @@
         <w:pStyle w:val="Heading1"/>
       </w:pPr>
       <w:r>
-        <w:t>12. Dataset</w:t>
+        <w:lastRenderedPageBreak/>
+        <w:t>12. Limitations</w:t>
       </w:r>
     </w:p>
     <w:p>
       <w:r>
-        <w:t>The final submission must contain the link to the independently verified dataset used by the project. The internship instructions state that the exact dataset used in the internship/masterclasses must not be reused.</w:t>
-      </w:r>
-    </w:p>
-    <w:p>
-      <w:proofErr w:type="gramStart"/>
-      <w:r>
-        <w:t xml:space="preserve">Dataset </w:t>
-      </w:r>
-      <w:r>
-        <w:t>:</w:t>
-      </w:r>
-      <w:proofErr w:type="gramEnd"/>
-      <w:r>
-        <w:t xml:space="preserve"> Pizza Sales Dataset</w:t>
-      </w:r>
-    </w:p>
-    <w:p>
-      <w:r>
-        <w:t>Important: Replace the placeholder above before submission. If the dataset license does not permit redistribution, provide the public source link and instructions rather than uploading the raw dataset.</w:t>
+        <w:t>The Power BI report and Python notebook are separate project layers. The notebook is based on the supplied Excel dataset. Dashboard-specific numerical claims should be validated against the final Power BI model before submission.</w:t>
       </w:r>
     </w:p>
     <w:p>
@@ -711,256 +230,15 @@
         <w:pStyle w:val="Heading1"/>
       </w:pPr>
       <w:r>
-        <w:t>13. Python Notebook</w:t>
+        <w:t>13. Conclusion</w:t>
       </w:r>
     </w:p>
     <w:p>
       <w:r>
-        <w:t>The accompanying Jupyter Notebook performs dataset inspection, data-quality checks, KPI calculations, category/product analysis and time analysis. The notebook expects the independently verified CSV dataset to be placed in the data folder.</w:t>
+        <w:t>The project provides a structured analytics workflow for converting pizza sales transactions into KPIs, trends, product insights, and business-oriented observations. It combines Python analysis and Power BI visualization to support data-driven interpretation.</w:t>
       </w:r>
     </w:p>
-    <w:p>
-      <w:pPr>
-        <w:pStyle w:val="Heading1"/>
-      </w:pPr>
-      <w:r>
-        <w:t>14. Project Files</w:t>
-      </w:r>
-    </w:p>
-    <w:tbl>
-      <w:tblPr>
-        <w:tblStyle w:val="TableGrid"/>
-        <w:tblW w:w="0" w:type="auto"/>
-        <w:jc w:val="center"/>
-        <w:tblLook w:val="04A0" w:firstRow="1" w:lastRow="0" w:firstColumn="1" w:lastColumn="0" w:noHBand="0" w:noVBand="1"/>
-      </w:tblPr>
-      <w:tblGrid>
-        <w:gridCol w:w="4395"/>
-        <w:gridCol w:w="4320"/>
-      </w:tblGrid>
-      <w:tr>
-        <w:trPr>
-          <w:jc w:val="center"/>
-        </w:trPr>
-        <w:tc>
-          <w:tcPr>
-            <w:tcW w:w="4320" w:type="dxa"/>
-          </w:tcPr>
-          <w:p>
-            <w:r>
-              <w:t>Required File</w:t>
-            </w:r>
-          </w:p>
-        </w:tc>
-        <w:tc>
-          <w:tcPr>
-            <w:tcW w:w="4320" w:type="dxa"/>
-          </w:tcPr>
-          <w:p>
-            <w:r>
-              <w:t>Purpose</w:t>
-            </w:r>
-          </w:p>
-        </w:tc>
-      </w:tr>
-      <w:tr>
-        <w:trPr>
-          <w:jc w:val="center"/>
-        </w:trPr>
-        <w:tc>
-          <w:tcPr>
-            <w:tcW w:w="4320" w:type="dxa"/>
-          </w:tcPr>
-          <w:p>
-            <w:r>
-              <w:t>PushpamSharma_PizzaSalesAnalytics.ipynb</w:t>
-            </w:r>
-          </w:p>
-        </w:tc>
-        <w:tc>
-          <w:tcPr>
-            <w:tcW w:w="4320" w:type="dxa"/>
-          </w:tcPr>
-          <w:p>
-            <w:r>
-              <w:t>Complete Python/Jupyter project code.</w:t>
-            </w:r>
-          </w:p>
-        </w:tc>
-      </w:tr>
-      <w:tr>
-        <w:trPr>
-          <w:jc w:val="center"/>
-        </w:trPr>
-        <w:tc>
-          <w:tcPr>
-            <w:tcW w:w="4320" w:type="dxa"/>
-          </w:tcPr>
-          <w:p>
-            <w:r>
-              <w:t>requirements.txt</w:t>
-            </w:r>
-          </w:p>
-        </w:tc>
-        <w:tc>
-          <w:tcPr>
-            <w:tcW w:w="4320" w:type="dxa"/>
-          </w:tcPr>
-          <w:p>
-            <w:r>
-              <w:t>Python libraries/dependencies required to run the notebook.</w:t>
-            </w:r>
-          </w:p>
-        </w:tc>
-      </w:tr>
-      <w:tr>
-        <w:trPr>
-          <w:jc w:val="center"/>
-        </w:trPr>
-        <w:tc>
-          <w:tcPr>
-            <w:tcW w:w="4320" w:type="dxa"/>
-          </w:tcPr>
-          <w:p>
-            <w:r>
-              <w:lastRenderedPageBreak/>
-              <w:t>PushpamSharma_ProjectReport.docx</w:t>
-            </w:r>
-          </w:p>
-        </w:tc>
-        <w:tc>
-          <w:tcPr>
-            <w:tcW w:w="4320" w:type="dxa"/>
-          </w:tcPr>
-          <w:p>
-            <w:r>
-              <w:t>Complete project documentation.</w:t>
-            </w:r>
-          </w:p>
-        </w:tc>
-      </w:tr>
-      <w:tr>
-        <w:trPr>
-          <w:jc w:val="center"/>
-        </w:trPr>
-        <w:tc>
-          <w:tcPr>
-            <w:tcW w:w="4320" w:type="dxa"/>
-          </w:tcPr>
-          <w:p>
-            <w:r>
-              <w:t>README.md</w:t>
-            </w:r>
-          </w:p>
-        </w:tc>
-        <w:tc>
-          <w:tcPr>
-            <w:tcW w:w="4320" w:type="dxa"/>
-          </w:tcPr>
-          <w:p>
-            <w:r>
-              <w:t>Project overview, dataset link, technologies and setup/run information.</w:t>
-            </w:r>
-          </w:p>
-        </w:tc>
-      </w:tr>
-    </w:tbl>
-    <w:p>
-      <w:pPr>
-        <w:pStyle w:val="Heading1"/>
-      </w:pPr>
-      <w:r>
-        <w:t>15. Setup and Execution</w:t>
-      </w:r>
-    </w:p>
-    <w:p>
-      <w:r>
-        <w:t>Create a virtual environment in Windows PowerShell:</w:t>
-      </w:r>
-    </w:p>
-    <w:p>
-      <w:pPr>
-        <w:pStyle w:val="IntenseQuote"/>
-      </w:pPr>
-      <w:r>
-        <w:t>python -m venv .venv</w:t>
-      </w:r>
-    </w:p>
-    <w:p>
-      <w:r>
-        <w:t>Activate it:</w:t>
-      </w:r>
-    </w:p>
-    <w:p>
-      <w:pPr>
-        <w:pStyle w:val="IntenseQuote"/>
-      </w:pPr>
-      <w:r>
-        <w:t>.\.venv\Scripts\Activate.ps1</w:t>
-      </w:r>
-    </w:p>
-    <w:p>
-      <w:r>
-        <w:t>Install dependencies:</w:t>
-      </w:r>
-    </w:p>
-    <w:p>
-      <w:pPr>
-        <w:pStyle w:val="IntenseQuote"/>
-      </w:pPr>
-      <w:r>
-        <w:t>pip install -r requirements.txt</w:t>
-      </w:r>
-    </w:p>
-    <w:p>
-      <w:r>
-        <w:t>Place the verified CSV dataset in the data folder, then launch Jupyter:</w:t>
-      </w:r>
-    </w:p>
-    <w:p>
-      <w:pPr>
-        <w:pStyle w:val="IntenseQuote"/>
-      </w:pPr>
-      <w:r>
-        <w:t>jupyter notebook</w:t>
-      </w:r>
-    </w:p>
-    <w:p>
-      <w:pPr>
-        <w:pStyle w:val="Heading1"/>
-      </w:pPr>
-      <w:r>
-        <w:t>16. Limitations</w:t>
-      </w:r>
-    </w:p>
-    <w:p>
-      <w:r>
-        <w:t>The Power BI report and the Python workflow are separate project layers. The PBIX file does not provide a reliable standalone Python CSV for automatic extraction in this submission workflow. Therefore, the Python notebook is designed to use the verified source dataset supplied by the student. Dataset-specific numerical conclusions must be validated before final submission.</w:t>
-      </w:r>
-    </w:p>
-    <w:p>
-      <w:pPr>
-        <w:pStyle w:val="Heading1"/>
-      </w:pPr>
-      <w:r>
-        <w:t>17. Conclusion</w:t>
-      </w:r>
-    </w:p>
-    <w:p>
-      <w:r>
-        <w:t>The project provides an interactive business intelligence solution for pizza sales analysis. It combines KPI monitoring, product analysis, time analysis and advanced Power BI analytics. Its objective is to support a structured transition from data to information, insights and business-oriented action.</w:t>
-      </w:r>
-    </w:p>
-    <w:p>
-      <w:pPr>
-        <w:pStyle w:val="ListBullet"/>
-        <w:numPr>
-          <w:ilvl w:val="0"/>
-          <w:numId w:val="0"/>
-        </w:numPr>
-        <w:ind w:left="360"/>
-      </w:pPr>
-    </w:p>
+    <w:p/>
     <w:sectPr>
       <w:pgSz w:w="12240" w:h="15840"/>
       <w:pgMar w:top="1440" w:right="1800" w:bottom="1440" w:left="1800" w:header="720" w:footer="720" w:gutter="0"/>
@@ -1144,31 +422,31 @@
       </w:rPr>
     </w:lvl>
   </w:abstractNum>
-  <w:num w:numId="1" w16cid:durableId="1253975060">
+  <w:num w:numId="1" w16cid:durableId="127630029">
     <w:abstractNumId w:val="8"/>
   </w:num>
-  <w:num w:numId="2" w16cid:durableId="342587331">
+  <w:num w:numId="2" w16cid:durableId="1292859721">
     <w:abstractNumId w:val="6"/>
   </w:num>
-  <w:num w:numId="3" w16cid:durableId="311716315">
+  <w:num w:numId="3" w16cid:durableId="142966688">
     <w:abstractNumId w:val="5"/>
   </w:num>
-  <w:num w:numId="4" w16cid:durableId="1903909594">
+  <w:num w:numId="4" w16cid:durableId="1754350160">
     <w:abstractNumId w:val="4"/>
   </w:num>
-  <w:num w:numId="5" w16cid:durableId="1685980780">
+  <w:num w:numId="5" w16cid:durableId="1552888510">
     <w:abstractNumId w:val="7"/>
   </w:num>
-  <w:num w:numId="6" w16cid:durableId="298540726">
+  <w:num w:numId="6" w16cid:durableId="460153039">
     <w:abstractNumId w:val="3"/>
   </w:num>
-  <w:num w:numId="7" w16cid:durableId="1168593547">
+  <w:num w:numId="7" w16cid:durableId="1738622622">
     <w:abstractNumId w:val="2"/>
   </w:num>
-  <w:num w:numId="8" w16cid:durableId="1231774481">
+  <w:num w:numId="8" w16cid:durableId="1587298461">
     <w:abstractNumId w:val="1"/>
   </w:num>
-  <w:num w:numId="9" w16cid:durableId="28603562">
+  <w:num w:numId="9" w16cid:durableId="1059523661">
     <w:abstractNumId w:val="0"/>
   </w:num>
 </w:numbering>
@@ -1565,7 +843,7 @@
     <w:qFormat/>
     <w:rsid w:val="00FC693F"/>
     <w:rPr>
-      <w:rFonts w:ascii="Arial" w:hAnsi="Arial"/>
+      <w:rFonts w:ascii="Calibri" w:hAnsi="Calibri"/>
       <w:sz w:val="21"/>
     </w:rPr>
   </w:style>

</xml_diff>